<commit_message>
Fix two typos in the material-and-technical-resources document
Co-Authored-By: Claude Opus 5.5 <noreply@anthropic.com>
</commit_message>
<xml_diff>
--- a/public/documents/Матеріально-технічне забезпечення закладу освіти.docx
+++ b/public/documents/Матеріально-технічне забезпечення закладу освіти.docx
@@ -336,7 +336,17 @@
           <w:szCs w:val="24"/>
           <w:lang w:val="uk-UA" w:eastAsia="ru-RU"/>
         </w:rPr>
-        <w:t xml:space="preserve">Тубівської селищної </w:t>
+        <w:t>Турбівської</w:t>
+      </w:r>
+      <w:r>
+        <w:rPr>
+          <w:rFonts w:ascii="Times New Roman" w:eastAsia="Times New Roman" w:hAnsi="Times New Roman" w:cs="Times New Roman"/>
+          <w:color w:val="212121"/>
+          <w:sz w:val="24"/>
+          <w:szCs w:val="24"/>
+          <w:lang w:val="uk-UA" w:eastAsia="ru-RU"/>
+        </w:rPr>
+        <w:t xml:space="preserve"> селищної </w:t>
       </w:r>
       <w:r>
         <w:rPr>
@@ -1870,7 +1880,17 @@
           <w:szCs w:val="24"/>
           <w:lang w:val="uk-UA" w:eastAsia="ru-RU"/>
         </w:rPr>
-        <w:t>учасників освітнього поцесу</w:t>
+        <w:t xml:space="preserve">учасників </w:t>
+      </w:r>
+      <w:r>
+        <w:rPr>
+          <w:rFonts w:ascii="Times New Roman" w:eastAsia="Times New Roman" w:hAnsi="Times New Roman" w:cs="Times New Roman"/>
+          <w:color w:val="212121"/>
+          <w:sz w:val="24"/>
+          <w:szCs w:val="24"/>
+          <w:lang w:val="uk-UA" w:eastAsia="ru-RU"/>
+        </w:rPr>
+        <w:t>освітнього процесу</w:t>
       </w:r>
       <w:r>
         <w:rPr>
@@ -2817,6 +2837,7 @@
   <w:style w:type="character" w:default="1" w:styleId="a0">
     <w:name w:val="Default Paragraph Font"/>
     <w:uiPriority w:val="1"/>
+    <w:semiHidden/>
     <w:unhideWhenUsed/>
   </w:style>
   <w:style w:type="table" w:default="1" w:styleId="a1">

</xml_diff>